<commit_message>
Number catalog entries and add the KBT video plus comment figure.
Renumber single-video files as 01/02/03 series and digest items as 1. 2. 3.
Append the comment screenshot, KBT title, and QR to video 1 and the digest.
Catalog BV11U4y1b7EV from figure 3, and add the short plus Grok4.3 foot-angle notes.

Co-authored-by: 36613453226Wallen <36613453226Wallen@users.noreply.github.com>
</commit_message>
<xml_diff>
--- a/files/综合拓展/视频综合目录.docx
+++ b/files/综合拓展/视频综合目录.docx
@@ -46,6 +46,9 @@
       </w:pPr>
     </w:p>
     <w:p>
+      <w:pPr>
+        <w:spacing w:before="0" w:after="80"/>
+      </w:pPr>
       <w:r>
         <w:rPr>
           <w:rFonts w:ascii="微软雅黑" w:hAnsi="微软雅黑" w:eastAsia="微软雅黑" w:cs="微软雅黑"/>
@@ -53,12 +56,12 @@
           <w:color w:val="1F2A44"/>
           <w:sz w:val="22"/>
         </w:rPr>
-        <w:t>拓展用累计目录。每条只保留标题、二维码，并留出「评论空间」「细节关注」两栏。</w:t>
+        <w:t>拓展用累计目录。每条按 1. 2. 3. 编号，只保留标题、二维码，并留出「评论空间」「细节关注」两栏。</w:t>
       </w:r>
     </w:p>
     <w:p>
       <w:pPr>
-        <w:spacing w:after="240"/>
+        <w:spacing w:before="0" w:after="240"/>
       </w:pPr>
       <w:r>
         <w:rPr>
@@ -105,9 +108,9 @@
                 <w:rFonts w:ascii="微软雅黑" w:hAnsi="微软雅黑" w:eastAsia="微软雅黑" w:cs="微软雅黑"/>
                 <w:b/>
                 <w:color w:val="C45C26"/>
-                <w:sz w:val="18"/>
+                <w:sz w:val="28"/>
               </w:rPr>
-              <w:t>条目 01</w:t>
+              <w:t>1.</w:t>
             </w:r>
           </w:p>
           <w:p>
@@ -151,11 +154,574 @@
                     <a:graphicData uri="http://schemas.openxmlformats.org/drawingml/2006/picture">
                       <pic:pic>
                         <pic:nvPicPr>
-                          <pic:cNvPr id="0" name="二维码.png"/>
+                          <pic:cNvPr id="0" name="03_二维码.png"/>
                           <pic:cNvPicPr/>
                         </pic:nvPicPr>
                         <pic:blipFill>
                           <a:blip r:embed="rId11"/>
+                          <a:stretch>
+                            <a:fillRect/>
+                          </a:stretch>
+                        </pic:blipFill>
+                        <pic:spPr>
+                          <a:xfrm>
+                            <a:off x="0" y="0"/>
+                            <a:ext cx="1296000" cy="1296000"/>
+                          </a:xfrm>
+                          <a:prstGeom prst="rect"/>
+                        </pic:spPr>
+                      </pic:pic>
+                    </a:graphicData>
+                  </a:graphic>
+                </wp:inline>
+              </w:drawing>
+            </w:r>
+          </w:p>
+          <w:p>
+            <w:r>
+              <w:rPr>
+                <w:rFonts w:ascii="微软雅黑" w:hAnsi="微软雅黑" w:eastAsia="微软雅黑" w:cs="微软雅黑"/>
+                <w:b/>
+                <w:color w:val="C45C26"/>
+                <w:sz w:val="18"/>
+              </w:rPr>
+              <w:t>评论区附图（图一）</w:t>
+            </w:r>
+          </w:p>
+          <w:p>
+            <w:pPr>
+              <w:spacing w:after="120"/>
+            </w:pPr>
+            <w:r>
+              <w:drawing>
+                <wp:inline xmlns:a="http://schemas.openxmlformats.org/drawingml/2006/main" xmlns:pic="http://schemas.openxmlformats.org/drawingml/2006/picture">
+                  <wp:extent cx="5472000" cy="5758371"/>
+                  <wp:docPr id="2" name="Picture 2"/>
+                  <wp:cNvGraphicFramePr>
+                    <a:graphicFrameLocks noChangeAspect="1"/>
+                  </wp:cNvGraphicFramePr>
+                  <a:graphic>
+                    <a:graphicData uri="http://schemas.openxmlformats.org/drawingml/2006/picture">
+                      <pic:pic>
+                        <pic:nvPicPr>
+                          <pic:cNvPr id="0" name="04_评论区.png"/>
+                          <pic:cNvPicPr/>
+                        </pic:nvPicPr>
+                        <pic:blipFill>
+                          <a:blip r:embed="rId12"/>
+                          <a:stretch>
+                            <a:fillRect/>
+                          </a:stretch>
+                        </pic:blipFill>
+                        <pic:spPr>
+                          <a:xfrm>
+                            <a:off x="0" y="0"/>
+                            <a:ext cx="5472000" cy="5758371"/>
+                          </a:xfrm>
+                          <a:prstGeom prst="rect"/>
+                        </pic:spPr>
+                      </pic:pic>
+                    </a:graphicData>
+                  </a:graphic>
+                </wp:inline>
+              </w:drawing>
+            </w:r>
+          </w:p>
+          <w:p>
+            <w:r>
+              <w:rPr>
+                <w:rFonts w:ascii="微软雅黑" w:hAnsi="微软雅黑" w:eastAsia="微软雅黑" w:cs="微软雅黑"/>
+                <w:b/>
+                <w:color w:val="1F2A44"/>
+                <w:sz w:val="20"/>
+              </w:rPr>
+              <w:t>【KBT干货】如何才能打造铁血防守？今天KBT告诉你2个细节！</w:t>
+            </w:r>
+          </w:p>
+          <w:p>
+            <w:r>
+              <w:rPr>
+                <w:rFonts w:ascii="微软雅黑" w:hAnsi="微软雅黑" w:eastAsia="微软雅黑" w:cs="微软雅黑"/>
+                <w:b w:val="0"/>
+                <w:color w:val="5C6473"/>
+                <w:sz w:val="18"/>
+              </w:rPr>
+              <w:t>延伸视频二维码</w:t>
+            </w:r>
+          </w:p>
+          <w:p>
+            <w:pPr>
+              <w:spacing w:after="160"/>
+            </w:pPr>
+            <w:r>
+              <w:drawing>
+                <wp:inline xmlns:a="http://schemas.openxmlformats.org/drawingml/2006/main" xmlns:pic="http://schemas.openxmlformats.org/drawingml/2006/picture">
+                  <wp:extent cx="1152000" cy="1152000"/>
+                  <wp:docPr id="3" name="Picture 3"/>
+                  <wp:cNvGraphicFramePr>
+                    <a:graphicFrameLocks noChangeAspect="1"/>
+                  </wp:cNvGraphicFramePr>
+                  <a:graphic>
+                    <a:graphicData uri="http://schemas.openxmlformats.org/drawingml/2006/picture">
+                      <pic:pic>
+                        <pic:nvPicPr>
+                          <pic:cNvPr id="0" name="05_延伸_BV11U4y1b7EV_二维码.png"/>
+                          <pic:cNvPicPr/>
+                        </pic:nvPicPr>
+                        <pic:blipFill>
+                          <a:blip r:embed="rId13"/>
+                          <a:stretch>
+                            <a:fillRect/>
+                          </a:stretch>
+                        </pic:blipFill>
+                        <pic:spPr>
+                          <a:xfrm>
+                            <a:off x="0" y="0"/>
+                            <a:ext cx="1152000" cy="1152000"/>
+                          </a:xfrm>
+                          <a:prstGeom prst="rect"/>
+                        </pic:spPr>
+                      </pic:pic>
+                    </a:graphicData>
+                  </a:graphic>
+                </wp:inline>
+              </w:drawing>
+            </w:r>
+          </w:p>
+          <w:tbl>
+            <w:tblPr>
+              <w:tblW w:type="auto" w:w="0"/>
+              <w:tblLayout w:type="autofit"/>
+              <w:tblLook w:firstColumn="1" w:firstRow="1" w:lastColumn="0" w:lastRow="0" w:noHBand="0" w:noVBand="1" w:val="04A0"/>
+            </w:tblPr>
+            <w:tblGrid>
+              <w:gridCol w:w="4933"/>
+              <w:gridCol w:w="4933"/>
+            </w:tblGrid>
+            <w:tr>
+              <w:tc>
+                <w:tcPr>
+                  <w:tcW w:type="dxa" w:w="4933"/>
+                  <w:shd w:fill="1F2A44" w:val="clear"/>
+                  <w:tcBorders>
+                    <w:top w:val="single" w:sz="8" w:space="0" w:color="1F2A44"/>
+                    <w:left w:val="single" w:sz="8" w:space="0" w:color="1F2A44"/>
+                    <w:bottom w:val="single" w:sz="8" w:space="0" w:color="1F2A44"/>
+                    <w:right w:val="single" w:sz="8" w:space="0" w:color="1F2A44"/>
+                  </w:tcBorders>
+                  <w:tcMar>
+                    <w:top w:w="60" w:type="dxa"/>
+                    <w:left w:w="100" w:type="dxa"/>
+                    <w:bottom w:w="60" w:type="dxa"/>
+                    <w:right w:w="100" w:type="dxa"/>
+                  </w:tcMar>
+                </w:tcPr>
+                <w:p>
+                  <w:r>
+                    <w:rPr>
+                      <w:rFonts w:ascii="微软雅黑" w:hAnsi="微软雅黑" w:eastAsia="微软雅黑" w:cs="微软雅黑"/>
+                      <w:b/>
+                      <w:color w:val="FFFFFF"/>
+                      <w:sz w:val="22"/>
+                    </w:rPr>
+                    <w:t>评论空间</w:t>
+                  </w:r>
+                </w:p>
+              </w:tc>
+              <w:tc>
+                <w:tcPr>
+                  <w:tcW w:type="dxa" w:w="4933"/>
+                  <w:shd w:fill="1F2A44" w:val="clear"/>
+                  <w:tcBorders>
+                    <w:top w:val="single" w:sz="8" w:space="0" w:color="1F2A44"/>
+                    <w:left w:val="single" w:sz="8" w:space="0" w:color="1F2A44"/>
+                    <w:bottom w:val="single" w:sz="8" w:space="0" w:color="1F2A44"/>
+                    <w:right w:val="single" w:sz="8" w:space="0" w:color="1F2A44"/>
+                  </w:tcBorders>
+                  <w:tcMar>
+                    <w:top w:w="60" w:type="dxa"/>
+                    <w:left w:w="100" w:type="dxa"/>
+                    <w:bottom w:w="60" w:type="dxa"/>
+                    <w:right w:w="100" w:type="dxa"/>
+                  </w:tcMar>
+                </w:tcPr>
+                <w:p>
+                  <w:r>
+                    <w:rPr>
+                      <w:rFonts w:ascii="微软雅黑" w:hAnsi="微软雅黑" w:eastAsia="微软雅黑" w:cs="微软雅黑"/>
+                      <w:b/>
+                      <w:color w:val="FFFFFF"/>
+                      <w:sz w:val="22"/>
+                    </w:rPr>
+                    <w:t>细节关注</w:t>
+                  </w:r>
+                </w:p>
+              </w:tc>
+            </w:tr>
+            <w:tr>
+              <w:tc>
+                <w:tcPr>
+                  <w:tcW w:type="dxa" w:w="4933"/>
+                  <w:shd w:fill="FAFBFC" w:val="clear"/>
+                  <w:tcBorders>
+                    <w:top w:val="single" w:sz="8" w:space="0" w:color="D0D5DD"/>
+                    <w:left w:val="single" w:sz="8" w:space="0" w:color="D0D5DD"/>
+                    <w:bottom w:val="single" w:sz="8" w:space="0" w:color="D0D5DD"/>
+                    <w:right w:val="single" w:sz="8" w:space="0" w:color="D0D5DD"/>
+                  </w:tcBorders>
+                  <w:tcMar>
+                    <w:top w:w="80" w:type="dxa"/>
+                    <w:left w:w="100" w:type="dxa"/>
+                    <w:bottom w:w="80" w:type="dxa"/>
+                    <w:right w:w="100" w:type="dxa"/>
+                  </w:tcMar>
+                </w:tcPr>
+                <w:p>
+                  <w:r>
+                    <w:rPr>
+                      <w:rFonts w:ascii="微软雅黑" w:hAnsi="微软雅黑" w:eastAsia="微软雅黑" w:cs="微软雅黑"/>
+                      <w:b w:val="0"/>
+                      <w:color w:val="5C6473"/>
+                      <w:sz w:val="18"/>
+                    </w:rPr>
+                    <w:t>写下观后感、疑问、可迁移到自己训练的点。</w:t>
+                  </w:r>
+                </w:p>
+                <w:p>
+                  <w:pPr>
+                    <w:spacing w:after="160"/>
+                  </w:pPr>
+                  <w:r>
+                    <w:rPr>
+                      <w:rFonts w:ascii="微软雅黑" w:hAnsi="微软雅黑" w:eastAsia="微软雅黑" w:cs="微软雅黑"/>
+                      <w:b w:val="0"/>
+                      <w:sz w:val="22"/>
+                    </w:rPr>
+                    <w:t xml:space="preserve"> </w:t>
+                  </w:r>
+                </w:p>
+                <w:p>
+                  <w:pPr>
+                    <w:spacing w:after="160"/>
+                  </w:pPr>
+                  <w:r>
+                    <w:rPr>
+                      <w:rFonts w:ascii="微软雅黑" w:hAnsi="微软雅黑" w:eastAsia="微软雅黑" w:cs="微软雅黑"/>
+                      <w:b w:val="0"/>
+                      <w:sz w:val="22"/>
+                    </w:rPr>
+                    <w:t xml:space="preserve"> </w:t>
+                  </w:r>
+                </w:p>
+                <w:p>
+                  <w:pPr>
+                    <w:spacing w:after="160"/>
+                  </w:pPr>
+                  <w:r>
+                    <w:rPr>
+                      <w:rFonts w:ascii="微软雅黑" w:hAnsi="微软雅黑" w:eastAsia="微软雅黑" w:cs="微软雅黑"/>
+                      <w:b w:val="0"/>
+                      <w:sz w:val="22"/>
+                    </w:rPr>
+                    <w:t xml:space="preserve"> </w:t>
+                  </w:r>
+                </w:p>
+                <w:p>
+                  <w:pPr>
+                    <w:spacing w:after="160"/>
+                  </w:pPr>
+                  <w:r>
+                    <w:rPr>
+                      <w:rFonts w:ascii="微软雅黑" w:hAnsi="微软雅黑" w:eastAsia="微软雅黑" w:cs="微软雅黑"/>
+                      <w:b w:val="0"/>
+                      <w:sz w:val="22"/>
+                    </w:rPr>
+                    <w:t xml:space="preserve"> </w:t>
+                  </w:r>
+                </w:p>
+                <w:p>
+                  <w:pPr>
+                    <w:spacing w:after="160"/>
+                  </w:pPr>
+                  <w:r>
+                    <w:rPr>
+                      <w:rFonts w:ascii="微软雅黑" w:hAnsi="微软雅黑" w:eastAsia="微软雅黑" w:cs="微软雅黑"/>
+                      <w:b w:val="0"/>
+                      <w:sz w:val="22"/>
+                    </w:rPr>
+                    <w:t xml:space="preserve"> </w:t>
+                  </w:r>
+                </w:p>
+                <w:p>
+                  <w:pPr>
+                    <w:spacing w:after="160"/>
+                  </w:pPr>
+                  <w:r>
+                    <w:rPr>
+                      <w:rFonts w:ascii="微软雅黑" w:hAnsi="微软雅黑" w:eastAsia="微软雅黑" w:cs="微软雅黑"/>
+                      <w:b w:val="0"/>
+                      <w:sz w:val="22"/>
+                    </w:rPr>
+                    <w:t xml:space="preserve"> </w:t>
+                  </w:r>
+                </w:p>
+                <w:p>
+                  <w:pPr>
+                    <w:spacing w:after="160"/>
+                  </w:pPr>
+                  <w:r>
+                    <w:rPr>
+                      <w:rFonts w:ascii="微软雅黑" w:hAnsi="微软雅黑" w:eastAsia="微软雅黑" w:cs="微软雅黑"/>
+                      <w:b w:val="0"/>
+                      <w:sz w:val="22"/>
+                    </w:rPr>
+                    <w:t xml:space="preserve"> </w:t>
+                  </w:r>
+                </w:p>
+                <w:p>
+                  <w:pPr>
+                    <w:spacing w:after="160"/>
+                  </w:pPr>
+                  <w:r>
+                    <w:rPr>
+                      <w:rFonts w:ascii="微软雅黑" w:hAnsi="微软雅黑" w:eastAsia="微软雅黑" w:cs="微软雅黑"/>
+                      <w:b w:val="0"/>
+                      <w:sz w:val="22"/>
+                    </w:rPr>
+                    <w:t xml:space="preserve"> </w:t>
+                  </w:r>
+                </w:p>
+              </w:tc>
+              <w:tc>
+                <w:tcPr>
+                  <w:tcW w:type="dxa" w:w="4933"/>
+                  <w:shd w:fill="FAFBFC" w:val="clear"/>
+                  <w:tcBorders>
+                    <w:top w:val="single" w:sz="8" w:space="0" w:color="D0D5DD"/>
+                    <w:left w:val="single" w:sz="8" w:space="0" w:color="D0D5DD"/>
+                    <w:bottom w:val="single" w:sz="8" w:space="0" w:color="D0D5DD"/>
+                    <w:right w:val="single" w:sz="8" w:space="0" w:color="D0D5DD"/>
+                  </w:tcBorders>
+                  <w:tcMar>
+                    <w:top w:w="80" w:type="dxa"/>
+                    <w:left w:w="100" w:type="dxa"/>
+                    <w:bottom w:w="80" w:type="dxa"/>
+                    <w:right w:w="100" w:type="dxa"/>
+                  </w:tcMar>
+                </w:tcPr>
+                <w:p>
+                  <w:r>
+                    <w:rPr>
+                      <w:rFonts w:ascii="微软雅黑" w:hAnsi="微软雅黑" w:eastAsia="微软雅黑" w:cs="微软雅黑"/>
+                      <w:b w:val="0"/>
+                      <w:color w:val="5C6473"/>
+                      <w:sz w:val="18"/>
+                    </w:rPr>
+                    <w:t>记下需要反复回看的时机、站位、脚步或口令。</w:t>
+                  </w:r>
+                </w:p>
+                <w:p>
+                  <w:pPr>
+                    <w:spacing w:after="160"/>
+                  </w:pPr>
+                  <w:r>
+                    <w:rPr>
+                      <w:rFonts w:ascii="微软雅黑" w:hAnsi="微软雅黑" w:eastAsia="微软雅黑" w:cs="微软雅黑"/>
+                      <w:b w:val="0"/>
+                      <w:sz w:val="22"/>
+                    </w:rPr>
+                    <w:t xml:space="preserve"> </w:t>
+                  </w:r>
+                </w:p>
+                <w:p>
+                  <w:pPr>
+                    <w:spacing w:after="160"/>
+                  </w:pPr>
+                  <w:r>
+                    <w:rPr>
+                      <w:rFonts w:ascii="微软雅黑" w:hAnsi="微软雅黑" w:eastAsia="微软雅黑" w:cs="微软雅黑"/>
+                      <w:b w:val="0"/>
+                      <w:sz w:val="22"/>
+                    </w:rPr>
+                    <w:t xml:space="preserve"> </w:t>
+                  </w:r>
+                </w:p>
+                <w:p>
+                  <w:pPr>
+                    <w:spacing w:after="160"/>
+                  </w:pPr>
+                  <w:r>
+                    <w:rPr>
+                      <w:rFonts w:ascii="微软雅黑" w:hAnsi="微软雅黑" w:eastAsia="微软雅黑" w:cs="微软雅黑"/>
+                      <w:b w:val="0"/>
+                      <w:sz w:val="22"/>
+                    </w:rPr>
+                    <w:t xml:space="preserve"> </w:t>
+                  </w:r>
+                </w:p>
+                <w:p>
+                  <w:pPr>
+                    <w:spacing w:after="160"/>
+                  </w:pPr>
+                  <w:r>
+                    <w:rPr>
+                      <w:rFonts w:ascii="微软雅黑" w:hAnsi="微软雅黑" w:eastAsia="微软雅黑" w:cs="微软雅黑"/>
+                      <w:b w:val="0"/>
+                      <w:sz w:val="22"/>
+                    </w:rPr>
+                    <w:t xml:space="preserve"> </w:t>
+                  </w:r>
+                </w:p>
+                <w:p>
+                  <w:pPr>
+                    <w:spacing w:after="160"/>
+                  </w:pPr>
+                  <w:r>
+                    <w:rPr>
+                      <w:rFonts w:ascii="微软雅黑" w:hAnsi="微软雅黑" w:eastAsia="微软雅黑" w:cs="微软雅黑"/>
+                      <w:b w:val="0"/>
+                      <w:sz w:val="22"/>
+                    </w:rPr>
+                    <w:t xml:space="preserve"> </w:t>
+                  </w:r>
+                </w:p>
+                <w:p>
+                  <w:pPr>
+                    <w:spacing w:after="160"/>
+                  </w:pPr>
+                  <w:r>
+                    <w:rPr>
+                      <w:rFonts w:ascii="微软雅黑" w:hAnsi="微软雅黑" w:eastAsia="微软雅黑" w:cs="微软雅黑"/>
+                      <w:b w:val="0"/>
+                      <w:sz w:val="22"/>
+                    </w:rPr>
+                    <w:t xml:space="preserve"> </w:t>
+                  </w:r>
+                </w:p>
+                <w:p>
+                  <w:pPr>
+                    <w:spacing w:after="160"/>
+                  </w:pPr>
+                  <w:r>
+                    <w:rPr>
+                      <w:rFonts w:ascii="微软雅黑" w:hAnsi="微软雅黑" w:eastAsia="微软雅黑" w:cs="微软雅黑"/>
+                      <w:b w:val="0"/>
+                      <w:sz w:val="22"/>
+                    </w:rPr>
+                    <w:t xml:space="preserve"> </w:t>
+                  </w:r>
+                </w:p>
+                <w:p>
+                  <w:pPr>
+                    <w:spacing w:after="160"/>
+                  </w:pPr>
+                  <w:r>
+                    <w:rPr>
+                      <w:rFonts w:ascii="微软雅黑" w:hAnsi="微软雅黑" w:eastAsia="微软雅黑" w:cs="微软雅黑"/>
+                      <w:b w:val="0"/>
+                      <w:sz w:val="22"/>
+                    </w:rPr>
+                    <w:t xml:space="preserve"> </w:t>
+                  </w:r>
+                </w:p>
+              </w:tc>
+            </w:tr>
+          </w:tbl>
+          <w:p/>
+        </w:tc>
+      </w:tr>
+    </w:tbl>
+    <w:p>
+      <w:pPr>
+        <w:spacing w:before="0" w:after="280" w:line="280" w:lineRule="exact"/>
+      </w:pPr>
+    </w:p>
+    <w:tbl>
+      <w:tblPr>
+        <w:tblW w:type="auto" w:w="0"/>
+        <w:tblLook w:firstColumn="1" w:firstRow="1" w:lastColumn="0" w:lastRow="0" w:noHBand="0" w:noVBand="1" w:val="04A0"/>
+      </w:tblPr>
+      <w:tblGrid>
+        <w:gridCol w:w="9866"/>
+      </w:tblGrid>
+      <w:tr>
+        <w:tc>
+          <w:tcPr>
+            <w:tcW w:type="dxa" w:w="9866"/>
+            <w:shd w:fill="F4F1EA" w:val="clear"/>
+            <w:tcBorders>
+              <w:top w:val="single" w:sz="12" w:space="0" w:color="C4A574"/>
+              <w:left w:val="single" w:sz="12" w:space="0" w:color="C4A574"/>
+              <w:bottom w:val="single" w:sz="12" w:space="0" w:color="C4A574"/>
+              <w:right w:val="single" w:sz="12" w:space="0" w:color="C4A574"/>
+            </w:tcBorders>
+            <w:tcMar>
+              <w:top w:w="100" w:type="dxa"/>
+              <w:left w:w="140" w:type="dxa"/>
+              <w:bottom w:w="100" w:type="dxa"/>
+              <w:right w:w="140" w:type="dxa"/>
+            </w:tcMar>
+          </w:tcPr>
+          <w:p>
+            <w:pPr>
+              <w:spacing w:after="80"/>
+            </w:pPr>
+            <w:r>
+              <w:rPr>
+                <w:rFonts w:ascii="微软雅黑" w:hAnsi="微软雅黑" w:eastAsia="微软雅黑" w:cs="微软雅黑"/>
+                <w:b/>
+                <w:color w:val="C45C26"/>
+                <w:sz w:val="28"/>
+              </w:rPr>
+              <w:t>2.</w:t>
+            </w:r>
+          </w:p>
+          <w:p>
+            <w:pPr>
+              <w:spacing w:after="160"/>
+            </w:pPr>
+            <w:r>
+              <w:rPr>
+                <w:rFonts w:ascii="微软雅黑" w:hAnsi="微软雅黑" w:eastAsia="微软雅黑" w:cs="微软雅黑"/>
+                <w:b/>
+                <w:color w:val="1F2A44"/>
+                <w:sz w:val="26"/>
+              </w:rPr>
+              <w:t>【KBT干货】如何才能打造铁血防守？今天KBT告诉你2个细节！</w:t>
+            </w:r>
+          </w:p>
+          <w:p>
+            <w:r>
+              <w:rPr>
+                <w:rFonts w:ascii="微软雅黑" w:hAnsi="微软雅黑" w:eastAsia="微软雅黑" w:cs="微软雅黑"/>
+                <w:b w:val="0"/>
+                <w:color w:val="5C6473"/>
+                <w:sz w:val="18"/>
+              </w:rPr>
+              <w:t>二维码（扫码打开视频）</w:t>
+            </w:r>
+          </w:p>
+          <w:p>
+            <w:pPr>
+              <w:spacing w:after="160"/>
+            </w:pPr>
+            <w:r>
+              <w:drawing>
+                <wp:inline xmlns:a="http://schemas.openxmlformats.org/drawingml/2006/main" xmlns:pic="http://schemas.openxmlformats.org/drawingml/2006/picture">
+                  <wp:extent cx="1296000" cy="1296000"/>
+                  <wp:docPr id="4" name="Picture 4"/>
+                  <wp:cNvGraphicFramePr>
+                    <a:graphicFrameLocks noChangeAspect="1"/>
+                  </wp:cNvGraphicFramePr>
+                  <a:graphic>
+                    <a:graphicData uri="http://schemas.openxmlformats.org/drawingml/2006/picture">
+                      <pic:pic>
+                        <pic:nvPicPr>
+                          <pic:cNvPr id="0" name="05_延伸_BV11U4y1b7EV_二维码.png"/>
+                          <pic:cNvPicPr/>
+                        </pic:nvPicPr>
+                        <pic:blipFill>
+                          <a:blip r:embed="rId13"/>
                           <a:stretch>
                             <a:fillRect/>
                           </a:stretch>

</xml_diff>

<commit_message>
Move the comment figure to the end of digest entry 1.
Keep title, QR, and writing columns first, then append the KBT title,
QR, and figure 1 so the image sits after the two columns.

Co-authored-by: 36613453226Wallen <36613453226Wallen@users.noreply.github.com>
</commit_message>
<xml_diff>
--- a/files/综合拓展/视频综合目录.docx
+++ b/files/综合拓展/视频综合目录.docx
@@ -167,117 +167,6 @@
                           <a:xfrm>
                             <a:off x="0" y="0"/>
                             <a:ext cx="1296000" cy="1296000"/>
-                          </a:xfrm>
-                          <a:prstGeom prst="rect"/>
-                        </pic:spPr>
-                      </pic:pic>
-                    </a:graphicData>
-                  </a:graphic>
-                </wp:inline>
-              </w:drawing>
-            </w:r>
-          </w:p>
-          <w:p>
-            <w:r>
-              <w:rPr>
-                <w:rFonts w:ascii="微软雅黑" w:hAnsi="微软雅黑" w:eastAsia="微软雅黑" w:cs="微软雅黑"/>
-                <w:b/>
-                <w:color w:val="C45C26"/>
-                <w:sz w:val="18"/>
-              </w:rPr>
-              <w:t>评论区附图（图一）</w:t>
-            </w:r>
-          </w:p>
-          <w:p>
-            <w:pPr>
-              <w:spacing w:after="120"/>
-            </w:pPr>
-            <w:r>
-              <w:drawing>
-                <wp:inline xmlns:a="http://schemas.openxmlformats.org/drawingml/2006/main" xmlns:pic="http://schemas.openxmlformats.org/drawingml/2006/picture">
-                  <wp:extent cx="5472000" cy="5758371"/>
-                  <wp:docPr id="2" name="Picture 2"/>
-                  <wp:cNvGraphicFramePr>
-                    <a:graphicFrameLocks noChangeAspect="1"/>
-                  </wp:cNvGraphicFramePr>
-                  <a:graphic>
-                    <a:graphicData uri="http://schemas.openxmlformats.org/drawingml/2006/picture">
-                      <pic:pic>
-                        <pic:nvPicPr>
-                          <pic:cNvPr id="0" name="04_评论区.png"/>
-                          <pic:cNvPicPr/>
-                        </pic:nvPicPr>
-                        <pic:blipFill>
-                          <a:blip r:embed="rId12"/>
-                          <a:stretch>
-                            <a:fillRect/>
-                          </a:stretch>
-                        </pic:blipFill>
-                        <pic:spPr>
-                          <a:xfrm>
-                            <a:off x="0" y="0"/>
-                            <a:ext cx="5472000" cy="5758371"/>
-                          </a:xfrm>
-                          <a:prstGeom prst="rect"/>
-                        </pic:spPr>
-                      </pic:pic>
-                    </a:graphicData>
-                  </a:graphic>
-                </wp:inline>
-              </w:drawing>
-            </w:r>
-          </w:p>
-          <w:p>
-            <w:r>
-              <w:rPr>
-                <w:rFonts w:ascii="微软雅黑" w:hAnsi="微软雅黑" w:eastAsia="微软雅黑" w:cs="微软雅黑"/>
-                <w:b/>
-                <w:color w:val="1F2A44"/>
-                <w:sz w:val="20"/>
-              </w:rPr>
-              <w:t>【KBT干货】如何才能打造铁血防守？今天KBT告诉你2个细节！</w:t>
-            </w:r>
-          </w:p>
-          <w:p>
-            <w:r>
-              <w:rPr>
-                <w:rFonts w:ascii="微软雅黑" w:hAnsi="微软雅黑" w:eastAsia="微软雅黑" w:cs="微软雅黑"/>
-                <w:b w:val="0"/>
-                <w:color w:val="5C6473"/>
-                <w:sz w:val="18"/>
-              </w:rPr>
-              <w:t>延伸视频二维码</w:t>
-            </w:r>
-          </w:p>
-          <w:p>
-            <w:pPr>
-              <w:spacing w:after="160"/>
-            </w:pPr>
-            <w:r>
-              <w:drawing>
-                <wp:inline xmlns:a="http://schemas.openxmlformats.org/drawingml/2006/main" xmlns:pic="http://schemas.openxmlformats.org/drawingml/2006/picture">
-                  <wp:extent cx="1152000" cy="1152000"/>
-                  <wp:docPr id="3" name="Picture 3"/>
-                  <wp:cNvGraphicFramePr>
-                    <a:graphicFrameLocks noChangeAspect="1"/>
-                  </wp:cNvGraphicFramePr>
-                  <a:graphic>
-                    <a:graphicData uri="http://schemas.openxmlformats.org/drawingml/2006/picture">
-                      <pic:pic>
-                        <pic:nvPicPr>
-                          <pic:cNvPr id="0" name="05_延伸_BV11U4y1b7EV_二维码.png"/>
-                          <pic:cNvPicPr/>
-                        </pic:nvPicPr>
-                        <pic:blipFill>
-                          <a:blip r:embed="rId13"/>
-                          <a:stretch>
-                            <a:fillRect/>
-                          </a:stretch>
-                        </pic:blipFill>
-                        <pic:spPr>
-                          <a:xfrm>
-                            <a:off x="0" y="0"/>
-                            <a:ext cx="1152000" cy="1152000"/>
                           </a:xfrm>
                           <a:prstGeom prst="rect"/>
                         </pic:spPr>
@@ -628,6 +517,131 @@
             </w:tr>
           </w:tbl>
           <w:p/>
+          <w:p>
+            <w:pPr>
+              <w:spacing w:before="200"/>
+            </w:pPr>
+            <w:r>
+              <w:rPr>
+                <w:rFonts w:ascii="微软雅黑" w:hAnsi="微软雅黑" w:eastAsia="微软雅黑" w:cs="微软雅黑"/>
+                <w:b/>
+                <w:color w:val="C45C26"/>
+                <w:sz w:val="18"/>
+              </w:rPr>
+              <w:t>文后附图</w:t>
+            </w:r>
+          </w:p>
+          <w:p>
+            <w:r>
+              <w:rPr>
+                <w:rFonts w:ascii="微软雅黑" w:hAnsi="微软雅黑" w:eastAsia="微软雅黑" w:cs="微软雅黑"/>
+                <w:b/>
+                <w:color w:val="1F2A44"/>
+                <w:sz w:val="20"/>
+              </w:rPr>
+              <w:t>【KBT干货】如何才能打造铁血防守？今天KBT告诉你2个细节！</w:t>
+            </w:r>
+          </w:p>
+          <w:p>
+            <w:r>
+              <w:rPr>
+                <w:rFonts w:ascii="微软雅黑" w:hAnsi="微软雅黑" w:eastAsia="微软雅黑" w:cs="微软雅黑"/>
+                <w:b w:val="0"/>
+                <w:color w:val="5C6473"/>
+                <w:sz w:val="18"/>
+              </w:rPr>
+              <w:t>延伸视频二维码</w:t>
+            </w:r>
+          </w:p>
+          <w:p>
+            <w:pPr>
+              <w:spacing w:after="120"/>
+            </w:pPr>
+            <w:r>
+              <w:drawing>
+                <wp:inline xmlns:a="http://schemas.openxmlformats.org/drawingml/2006/main" xmlns:pic="http://schemas.openxmlformats.org/drawingml/2006/picture">
+                  <wp:extent cx="1152000" cy="1152000"/>
+                  <wp:docPr id="2" name="Picture 2"/>
+                  <wp:cNvGraphicFramePr>
+                    <a:graphicFrameLocks noChangeAspect="1"/>
+                  </wp:cNvGraphicFramePr>
+                  <a:graphic>
+                    <a:graphicData uri="http://schemas.openxmlformats.org/drawingml/2006/picture">
+                      <pic:pic>
+                        <pic:nvPicPr>
+                          <pic:cNvPr id="0" name="05_延伸_BV11U4y1b7EV_二维码.png"/>
+                          <pic:cNvPicPr/>
+                        </pic:nvPicPr>
+                        <pic:blipFill>
+                          <a:blip r:embed="rId12"/>
+                          <a:stretch>
+                            <a:fillRect/>
+                          </a:stretch>
+                        </pic:blipFill>
+                        <pic:spPr>
+                          <a:xfrm>
+                            <a:off x="0" y="0"/>
+                            <a:ext cx="1152000" cy="1152000"/>
+                          </a:xfrm>
+                          <a:prstGeom prst="rect"/>
+                        </pic:spPr>
+                      </pic:pic>
+                    </a:graphicData>
+                  </a:graphic>
+                </wp:inline>
+              </w:drawing>
+            </w:r>
+          </w:p>
+          <w:p>
+            <w:r>
+              <w:rPr>
+                <w:rFonts w:ascii="微软雅黑" w:hAnsi="微软雅黑" w:eastAsia="微软雅黑" w:cs="微软雅黑"/>
+                <w:b w:val="0"/>
+                <w:color w:val="5C6473"/>
+                <w:sz w:val="18"/>
+              </w:rPr>
+              <w:t>评论区截图（图一）</w:t>
+            </w:r>
+          </w:p>
+          <w:p>
+            <w:pPr>
+              <w:spacing w:after="120"/>
+            </w:pPr>
+            <w:r>
+              <w:drawing>
+                <wp:inline xmlns:a="http://schemas.openxmlformats.org/drawingml/2006/main" xmlns:pic="http://schemas.openxmlformats.org/drawingml/2006/picture">
+                  <wp:extent cx="5472000" cy="5758371"/>
+                  <wp:docPr id="3" name="Picture 3"/>
+                  <wp:cNvGraphicFramePr>
+                    <a:graphicFrameLocks noChangeAspect="1"/>
+                  </wp:cNvGraphicFramePr>
+                  <a:graphic>
+                    <a:graphicData uri="http://schemas.openxmlformats.org/drawingml/2006/picture">
+                      <pic:pic>
+                        <pic:nvPicPr>
+                          <pic:cNvPr id="0" name="04_评论区.png"/>
+                          <pic:cNvPicPr/>
+                        </pic:nvPicPr>
+                        <pic:blipFill>
+                          <a:blip r:embed="rId13"/>
+                          <a:stretch>
+                            <a:fillRect/>
+                          </a:stretch>
+                        </pic:blipFill>
+                        <pic:spPr>
+                          <a:xfrm>
+                            <a:off x="0" y="0"/>
+                            <a:ext cx="5472000" cy="5758371"/>
+                          </a:xfrm>
+                          <a:prstGeom prst="rect"/>
+                        </pic:spPr>
+                      </pic:pic>
+                    </a:graphicData>
+                  </a:graphic>
+                </wp:inline>
+              </w:drawing>
+            </w:r>
+          </w:p>
         </w:tc>
       </w:tr>
     </w:tbl>
@@ -721,7 +735,7 @@
                           <pic:cNvPicPr/>
                         </pic:nvPicPr>
                         <pic:blipFill>
-                          <a:blip r:embed="rId13"/>
+                          <a:blip r:embed="rId12"/>
                           <a:stretch>
                             <a:fillRect/>
                           </a:stretch>

</xml_diff>